<commit_message>
add new figures and update documents for manuscript
</commit_message>
<xml_diff>
--- a/site/index_nature_submission.docx
+++ b/site/index_nature_submission.docx
@@ -2198,10 +2198,7 @@
         <w:fldChar w:fldCharType="separate"/>
       </w:r>
       <w:r>
-        <w:t xml:space="preserve">Table </w:t>
-      </w:r>
-      <w:r>
-        <w:t>1</w:t>
+        <w:t>Table 1</w:t>
       </w:r>
       <w:r>
         <w:fldChar w:fldCharType="end"/>
@@ -2309,19 +2306,7 @@
           <w:rPr>
             <w:rStyle w:val="Hyperlink"/>
           </w:rPr>
-          <w:t>https://github.com/v</w:t>
-        </w:r>
-        <w:r>
-          <w:rPr>
-            <w:rStyle w:val="Hyperlink"/>
-          </w:rPr>
-          <w:t>i</w:t>
-        </w:r>
-        <w:r>
-          <w:rPr>
-            <w:rStyle w:val="Hyperlink"/>
-          </w:rPr>
-          <w:t>neetjnair9/distributed-energy-resources-equity-CA</w:t>
+          <w:t>https://github.com/vineetjnair9/distributed-energy-resources-equity-CA</w:t>
         </w:r>
       </w:hyperlink>
       <w:r>
@@ -2477,21 +2462,11 @@
       <w:r>
         <w:t>(</w:t>
       </w:r>
-      <w:r>
-        <w:fldChar w:fldCharType="begin"/>
-      </w:r>
-      <w:r>
-        <w:instrText xml:space="preserve"> SEQ Equation \* ARABIC </w:instrText>
-      </w:r>
-      <w:r>
-        <w:fldChar w:fldCharType="separate"/>
-      </w:r>
-      <w:r>
-        <w:t>1</w:t>
-      </w:r>
-      <w:r>
-        <w:fldChar w:fldCharType="end"/>
-      </w:r>
+      <w:fldSimple w:instr=" SEQ Equation \* ARABIC ">
+        <w:r>
+          <w:t>1</w:t>
+        </w:r>
+      </w:fldSimple>
       <w:r>
         <w:t>)</w:t>
       </w:r>
@@ -2552,21 +2527,11 @@
       <w:r>
         <w:t>(</w:t>
       </w:r>
-      <w:r>
-        <w:fldChar w:fldCharType="begin"/>
-      </w:r>
-      <w:r>
-        <w:instrText xml:space="preserve"> SEQ Equation \* ARABIC </w:instrText>
-      </w:r>
-      <w:r>
-        <w:fldChar w:fldCharType="separate"/>
-      </w:r>
-      <w:r>
-        <w:t>2</w:t>
-      </w:r>
-      <w:r>
-        <w:fldChar w:fldCharType="end"/>
-      </w:r>
+      <w:fldSimple w:instr=" SEQ Equation \* ARABIC ">
+        <w:r>
+          <w:t>2</w:t>
+        </w:r>
+      </w:fldSimple>
       <w:r>
         <w:t>)</w:t>
       </w:r>
@@ -2627,21 +2592,11 @@
       <w:r>
         <w:t>(</w:t>
       </w:r>
-      <w:r>
-        <w:fldChar w:fldCharType="begin"/>
-      </w:r>
-      <w:r>
-        <w:instrText xml:space="preserve"> SEQ Equation \* ARABIC </w:instrText>
-      </w:r>
-      <w:r>
-        <w:fldChar w:fldCharType="separate"/>
-      </w:r>
-      <w:r>
-        <w:t>3</w:t>
-      </w:r>
-      <w:r>
-        <w:fldChar w:fldCharType="end"/>
-      </w:r>
+      <w:fldSimple w:instr=" SEQ Equation \* ARABIC ">
+        <w:r>
+          <w:t>3</w:t>
+        </w:r>
+      </w:fldSimple>
       <w:r>
         <w:t>)</w:t>
       </w:r>
@@ -2880,7 +2835,16 @@
     </w:p>
     <w:p>
       <w:r>
-        <w:t>We estimate two complementary families of specifications. The first is a model series: each specification varies exactly one control block against a fixed core of income, race and ethnicity shares, poverty rate and the outcome-specific resource control. The blocks are education, housing value, housing structure, tenure, alternative climate and resource measures, centered income-by-race interactions, utility fixed effects, geographic controls, infrastructure context and an electricity-demand proxy. The series answers which single block moves which coefficient, not whether the blocks jointly absorb an effect. Full specifications and coefficient tables are in Supplementary Table S18.</w:t>
+        <w:t xml:space="preserve">We estimate two complementary families of specifications. The first is a model series: each specification varies exactly one control block against a fixed core of income, race and ethnicity shares, poverty rate and the outcome-specific resource control. </w:t>
+      </w:r>
+      <w:r>
+        <w:t>The blocks are education (Model 2A), housing value (Model 2B), housing structure (Model 2C), tenure (Model 2D), alternative climate and resource measures (Models 3A–3C), centered income-by-race interactions (Model 4, with Model 4R dropping the poverty control), utility fixed effects (Model 5, with Model 5C clustering by county), geographic controls (Models 6A–6B), infrastructure context (Model 7) and an electricity-demand proxy (Model 8)</w:t>
+      </w:r>
+      <w:r>
+        <w:t xml:space="preserve">. </w:t>
+      </w:r>
+      <w:r>
+        <w:t>The series answers which single block moves which coefficient, not whether the blocks jointly absorb an effect. Full specifications and coefficient tables are in Supplementary Table S18.</w:t>
       </w:r>
     </w:p>
     <w:p>
@@ -3073,11 +3037,11 @@
         <w:fldChar w:fldCharType="end"/>
       </w:r>
       <w:r>
-        <w:t xml:space="preserve">), especially once multiple SES and contextual controls are introduced. We retain predictors when they correspond to substantively distinct constructs that are </w:t>
+        <w:t xml:space="preserve">), especially once multiple SES and contextual </w:t>
       </w:r>
       <w:r>
         <w:lastRenderedPageBreak/>
-        <w:t>central to the modeling objective rather than treating any moderate VIF increase as evidence that the model is unusable. The relevant question for this paper is therefore whether the coefficients of interest remain interpretable and stable, not whether every rich specification minimizes collinearity by design.</w:t>
+        <w:t>controls are introduced. We retain predictors when they correspond to substantively distinct constructs that are central to the modeling objective rather than treating any moderate VIF increase as evidence that the model is unusable. The relevant question for this paper is therefore whether the coefficients of interest remain interpretable and stable, not whether every rich specification minimizes collinearity by design.</w:t>
       </w:r>
     </w:p>
     <w:p>
@@ -3189,12 +3153,15 @@
     </w:p>
     <w:p>
       <w:r>
-        <w:t>There are also technology-specific measurement limitations. Aggregate charger counts mix charger types and host contexts that may not represent equivalent forms of access. The charger-type decomposition (Supplementary Table S4 and Figure 2) helps, but even that does not fully distinguish residential, workplace, corridor, and municipal use cases. Wind outcomes are also less directly comparable to behind-the-meter technologies, which is why the paper treats wind capacity as supplementary context rather than a headline equity result (Supplementary Note S10; Supplementary Fig. S13).</w:t>
+        <w:t xml:space="preserve">There are also technology-specific measurement limitations. Aggregate charger counts mix charger types and host contexts that may not represent equivalent forms of access. The charger-type decomposition (Supplementary Table S4 and Figure 2) helps, but even that does not fully distinguish residential, workplace, corridor, and municipal use cases. Wind outcomes are also less directly comparable to behind-the-meter technologies, which is </w:t>
+      </w:r>
+      <w:r>
+        <w:lastRenderedPageBreak/>
+        <w:t>why the paper treats wind capacity as supplementary context rather than a headline equity result (Supplementary Note S10; Supplementary Fig. S13).</w:t>
       </w:r>
     </w:p>
     <w:p>
       <w:r>
-        <w:lastRenderedPageBreak/>
         <w:t>Finally, the paper is a California 2023 cross-sectional snapshot. The results may not generalize mechanically to other states, years, or regulatory contexts. Future work would benefit from longitudinal analysis, property- or household-level tenancy and roof-suitability measures, direct data on technology-specific access mechanisms, and place-based measures such as transit and corridor intensity.</w:t>
       </w:r>
     </w:p>
@@ -3273,6 +3240,7 @@
         <w:pStyle w:val="Heading1"/>
       </w:pPr>
       <w:r>
+        <w:lastRenderedPageBreak/>
         <w:t>References</w:t>
       </w:r>
     </w:p>
@@ -3329,7 +3297,6 @@
               <w:rFonts w:eastAsia="Times New Roman" w:cs="Times New Roman"/>
               <w:color w:val="000000"/>
             </w:rPr>
-            <w:lastRenderedPageBreak/>
             <w:t>[2]D. A. Sunter, S. Castellanos, and D. M. Kammen, “Disparities in rooftop photovoltaics deployment in the United States by race and ethnicity,” Nat. Sustain., vol. 2, no. 1, pp. 71–76, Jan. 2019, doi:10.1038/s41893-018-0204-z.</w:t>
           </w:r>
           <w:r>
@@ -3720,6 +3687,7 @@
               <w:rFonts w:eastAsia="Times New Roman" w:cs="Times New Roman"/>
               <w:color w:val="000000"/>
             </w:rPr>
+            <w:lastRenderedPageBreak/>
             <w:t>[16]R. Haider, Y. Xu, and W. Yang, “Towards closing the data gap: A project-driven distributed energy resource dataset for the U.S. Grid,” in e-Energy 2023 Companion - Proceedings of the 14th ACM International Conference on Future Energy Systems, 2023. doi:10.1145/3599733.3600250.</w:t>
           </w:r>
           <w:r>
@@ -3748,7 +3716,6 @@
               <w:rFonts w:eastAsia="Times New Roman" w:cs="Times New Roman"/>
               <w:color w:val="000000"/>
             </w:rPr>
-            <w:lastRenderedPageBreak/>
             <w:t>[17]L. Ge, T. Du, C. Li, Y. Li, J. Yan, and M. U. Rafiq, “Virtual Collection for Distributed Photovoltaic Data: Challenges, Methodologies, and Applications,” 2022. doi:10.3390/en15238783.</w:t>
           </w:r>
           <w:r>

</xml_diff>